<commit_message>
Hopefully I can put DOCX away forever
</commit_message>
<xml_diff>
--- a/_workspace/books/ashley-tower/ashley-tower.docx
+++ b/_workspace/books/ashley-tower/ashley-tower.docx
@@ -1,6 +1,6 @@
 
 <file path=word/document.xml><?xml version="1.0" encoding="utf-8"?>
-<w:document xmlns:wpc="http://schemas.microsoft.com/office/word/2010/wordprocessingCanvas" xmlns:cx="http://schemas.microsoft.com/office/drawing/2014/chartex" xmlns:cx1="http://schemas.microsoft.com/office/drawing/2015/9/8/chartex" xmlns:cx2="http://schemas.microsoft.com/office/drawing/2015/10/21/chartex" xmlns:cx3="http://schemas.microsoft.com/office/drawing/2016/5/9/chartex" xmlns:cx4="http://schemas.microsoft.com/office/drawing/2016/5/10/chartex" xmlns:cx5="http://schemas.microsoft.com/office/drawing/2016/5/11/chartex" xmlns:cx6="http://schemas.microsoft.com/office/drawing/2016/5/12/chartex" xmlns:cx7="http://schemas.microsoft.com/office/drawing/2016/5/13/chartex" xmlns:cx8="http://schemas.microsoft.com/office/drawing/2016/5/14/chartex" xmlns:mc="http://schemas.openxmlformats.org/markup-compatibility/2006" xmlns:aink="http://schemas.microsoft.com/office/drawing/2016/ink" xmlns:am3d="http://schemas.microsoft.com/office/drawing/2017/model3d" xmlns:o="urn:schemas-microsoft-com:office:office" xmlns:oel="http://schemas.microsoft.com/office/2019/extlst" xmlns:r="http://schemas.openxmlformats.org/officeDocument/2006/relationships" xmlns:m="http://schemas.openxmlformats.org/officeDocument/2006/math" xmlns:v="urn:schemas-microsoft-com:vml" xmlns:wp14="http://schemas.microsoft.com/office/word/2010/wordprocessingDrawing" xmlns:wp="http://schemas.openxmlformats.org/drawingml/2006/wordprocessingDrawing" xmlns:w10="urn:schemas-microsoft-com:office:word" xmlns:w="http://schemas.openxmlformats.org/wordprocessingml/2006/main" xmlns:w14="http://schemas.microsoft.com/office/word/2010/wordml" xmlns:w15="http://schemas.microsoft.com/office/word/2012/wordml" xmlns:w16cex="http://schemas.microsoft.com/office/word/2018/wordml/cex" xmlns:w16cid="http://schemas.microsoft.com/office/word/2016/wordml/cid" xmlns:w16="http://schemas.microsoft.com/office/word/2018/wordml" xmlns:w16du="http://schemas.microsoft.com/office/word/2023/wordml/word16du" xmlns:w16sdtdh="http://schemas.microsoft.com/office/word/2020/wordml/sdtdatahash" xmlns:w16sdtfl="http://schemas.microsoft.com/office/word/2024/wordml/sdtformatlock" xmlns:w16se="http://schemas.microsoft.com/office/word/2015/wordml/symex" xmlns:wpg="http://schemas.microsoft.com/office/word/2010/wordprocessingGroup" xmlns:wpi="http://schemas.microsoft.com/office/word/2010/wordprocessingInk" xmlns:wne="http://schemas.microsoft.com/office/word/2006/wordml" xmlns:wps="http://schemas.microsoft.com/office/word/2010/wordprocessingShape" mc:Ignorable="w14 w15 w16se w16cid w16 w16cex w16sdtdh w16sdtfl w16du wp14">
+<w:document xmlns:wpc="http://schemas.microsoft.com/office/word/2010/wordprocessingCanvas" xmlns:cx="http://schemas.microsoft.com/office/drawing/2014/chartex" xmlns:cx1="http://schemas.microsoft.com/office/drawing/2015/9/8/chartex" xmlns:cx2="http://schemas.microsoft.com/office/drawing/2015/10/21/chartex" xmlns:cx3="http://schemas.microsoft.com/office/drawing/2016/5/9/chartex" xmlns:cx4="http://schemas.microsoft.com/office/drawing/2016/5/10/chartex" xmlns:cx5="http://schemas.microsoft.com/office/drawing/2016/5/11/chartex" xmlns:cx6="http://schemas.microsoft.com/office/drawing/2016/5/12/chartex" xmlns:cx7="http://schemas.microsoft.com/office/drawing/2016/5/13/chartex" xmlns:cx8="http://schemas.microsoft.com/office/drawing/2016/5/14/chartex" xmlns:mc="http://schemas.openxmlformats.org/markup-compatibility/2006" xmlns:m="http://schemas.openxmlformats.org/officeDocument/2006/math" xmlns:aink="http://schemas.microsoft.com/office/drawing/2016/ink" xmlns:am3d="http://schemas.microsoft.com/office/drawing/2017/model3d" xmlns:oel="http://schemas.microsoft.com/office/2019/extlst" xmlns:r="http://schemas.openxmlformats.org/officeDocument/2006/relationships" xmlns:wp14="http://schemas.microsoft.com/office/word/2010/wordprocessingDrawing" xmlns:wp="http://schemas.openxmlformats.org/drawingml/2006/wordprocessingDrawing" xmlns:wpg="http://schemas.microsoft.com/office/word/2010/wordprocessingGroup" xmlns:wpi="http://schemas.microsoft.com/office/word/2010/wordprocessingInk" xmlns:wps="http://schemas.microsoft.com/office/word/2010/wordprocessingShape" xmlns:o="urn:schemas-microsoft-com:office:office" xmlns:v="urn:schemas-microsoft-com:vml" xmlns:w10="urn:schemas-microsoft-com:office:word" xmlns:w="http://schemas.openxmlformats.org/wordprocessingml/2006/main" xmlns:w14="http://schemas.microsoft.com/office/word/2010/wordml" xmlns:w15="http://schemas.microsoft.com/office/word/2012/wordml" xmlns:w16cei="http://schemas.microsoft.com/office/word/2026/wordml/cei" xmlns:w16cex="http://schemas.microsoft.com/office/word/2018/wordml/cex" xmlns:w16cid="http://schemas.microsoft.com/office/word/2016/wordml/cid" xmlns:w16="http://schemas.microsoft.com/office/word/2018/wordml" xmlns:w16sdtdh="http://schemas.microsoft.com/office/word/2020/wordml/sdtdatahash" xmlns:w16sdtfl="http://schemas.microsoft.com/office/word/2024/wordml/sdtformatlock" xmlns:w16se="http://schemas.microsoft.com/office/word/2015/wordml/symex" xmlns:w16du="http://schemas.microsoft.com/office/word/2023/wordml/word16du" xmlns:wne="http://schemas.microsoft.com/office/word/2006/wordml" mc:Ignorable="w14 w15 w16se w16cid w16 w16cex w16sdtdh w16sdtfl w16du wp14">
   <w:body>
     <w:p>
       <w:pPr>
@@ -98,7 +98,6 @@
     </w:p>
     <w:p>
       <w:r>
-        <w:lastRenderedPageBreak/>
         <w:t>She flipped the notebook open to a page completely covered in careful scribbles, highlighted dates, and hidden logistics.</w:t>
       </w:r>
     </w:p>
@@ -151,23 +150,22 @@
     </w:p>
     <w:p>
       <w:r>
-        <w:t>Donald gripped the armrests of his cheap, heavy manual wheelchair as Mary expertly angled the casters, pulling him backward over the slight lip of the doorway. The cramped, standard-issue bathroom offered virtually zero maneuverability. Every physical transition in this room required a grueling, highly coordinated dance between the two of them, compensating for the complete lack of accessibility hardware.</w:t>
-      </w:r>
-    </w:p>
-    <w:p>
-      <w:r>
-        <w:t>Mary locked the brakes on his chair. With practiced, effortless strength born from a decade of necessity, she wrapped her arms under his shoulders, securely bearing his weight as she helped him transfer.</w:t>
-      </w:r>
-    </w:p>
-    <w:p>
-      <w:r>
-        <w:lastRenderedPageBreak/>
-        <w:t xml:space="preserve">Once he was safely situated, the routine shifted into its most critical phase. The intimate logistics of Donald's daily care were handled with a brisk, quiet dignity, entirely focused on his physical safety rather than the granular mechanics of the tasks. </w:t>
-      </w:r>
-    </w:p>
-    <w:p>
-      <w:r>
-        <w:t>Mary did not step out into the hallway to give him privacy. Instead, she sat down heavily on the edge of the porcelain bathtub, resting her elbows on her knees.</w:t>
+        <w:t>Because his heavy manual wheelchair remained parked at the base of the sweeping staircase on the first floor, every movement upstairs required a grueling, highly coordinated physical transfer. Mary adjusted her grip around Donald’s waist, securely bearing his weight as she carried him from the edge of their shared mattress across the short distance of the bedroom. She expertly angled her shoulders to clear the cramped bathroom doorway, compensating for the complete lack of accessibility hardware.</w:t>
+      </w:r>
+    </w:p>
+    <w:p>
+      <w:r>
+        <w:t>With practiced, effortless strength born from a decade of necessity, she carefully lowered him, ensuring he was safely situated on the porcelain before stepping back.</w:t>
+      </w:r>
+    </w:p>
+    <w:p>
+      <w:r>
+        <w:t>Once he was secure, the routine shifted into its most critical phase. The intimate logistics of Donald's daily care were handled with a brisk, quiet dignity, entirely focused on his physical safety rather than the granular mechanics of the tasks.</w:t>
+      </w:r>
+    </w:p>
+    <w:p>
+      <w:r>
+        <w:t>Mary did not step out into the hallway to give him privacy. Instead, she sat down heavily on the edge of the bathtub, resting her elbows on her knees.</w:t>
       </w:r>
     </w:p>
     <w:p>
@@ -202,7 +200,7 @@
     </w:p>
     <w:p>
       <w:r>
-        <w:t xml:space="preserve">The rush of the hot water felt incredible against Donald's rigid muscles, temporarily melting away the spasticity and the dull ache of the carry up the stairs. The environment was purely functional, a clinical progression of soap, warm water, and heavy towels, executed with the profound, unspoken trust of two people who had spent their entire childhoods surviving the same hostile territory. </w:t>
+        <w:t>The rush of the hot water felt incredible against Donald's rigid muscles, temporarily melting away the spasticity and the dull ache of the carry up the stairs. The environment was purely functional, a clinical progression of soap, warm water, and heavy towels, executed with the profound, unspoken trust of two people who had spent their entire childhoods surviving the same hostile territory.</w:t>
       </w:r>
     </w:p>
     <w:p>
@@ -212,8 +210,7 @@
     </w:p>
     <w:p>
       <w:r>
-        <w:lastRenderedPageBreak/>
-        <w:t>Mary helped him transfer back onto the edge of their shared mattress, leaving his wheelchair parked near the dresser. She grabbed a towel, vigorously drying her own damp hair as she sat down next to him with a heavy, exhausted sigh.</w:t>
+        <w:t>Mary scooped him into another secure carry, hauling him out of the steamy bathroom and gently setting him down onto the edge of their shared mattress. She grabbed a towel, vigorously drying her own damp hair as she sat down next to him with a heavy, exhausted sigh.</w:t>
       </w:r>
     </w:p>
     <w:p>
@@ -273,11 +270,7 @@
     </w:p>
     <w:p>
       <w:r>
-        <w:t xml:space="preserve">"Just a heads up as we look toward the start of next week," the weatherman noted, gesturing to a sweeping blue line on the map. "We're tracking a cold front dipping down </w:t>
-      </w:r>
-      <w:r>
-        <w:lastRenderedPageBreak/>
-        <w:t>from the plains. Temperatures look to be dropping into the thirties and forties by Monday night into Tuesday."</w:t>
+        <w:t>"Just a heads up as we look toward the start of next week," the weatherman noted, gesturing to a sweeping blue line on the map. "We're tracking a cold front dipping down from the plains. Temperatures look to be dropping into the thirties and forties by Monday night into Tuesday."</w:t>
       </w:r>
     </w:p>
     <w:p>
@@ -348,7 +341,6 @@
     </w:p>
     <w:p>
       <w:r>
-        <w:lastRenderedPageBreak/>
         <w:t>Then came the stairs. Donald braced his core, wrapping his arms securely around Mary's neck as she lifted his weight. The descent down the sweeping, ostentatious staircase of the McMansion was an agonizing, daily reminder of his father's priorities. Donald hated the vulnerability of the transfer, forced to rely entirely on Mary's physical stamina because the sprawling house was built to project wealth, not accommodate a wheelchair.</w:t>
       </w:r>
     </w:p>
@@ -394,7 +386,6 @@
     </w:p>
     <w:p>
       <w:r>
-        <w:lastRenderedPageBreak/>
         <w:t>"Have a good day," Mary whispered softly near his ear. She pulled back, brushing a stray lock of hair from his forehead, her eyes meeting his with absolute, unwavering certainty. "I'll be right here waiting when the bus brings you home."</w:t>
       </w:r>
     </w:p>
@@ -448,7 +439,6 @@
     </w:p>
     <w:p>
       <w:r>
-        <w:lastRenderedPageBreak/>
         <w:t>Mary’s brow furrowed. Single digits. That wasn't just a cold snap; that was genuinely dangerous.</w:t>
       </w:r>
     </w:p>
@@ -507,11 +497,7 @@
     </w:p>
     <w:p>
       <w:r>
-        <w:t xml:space="preserve">The hydraulic lift whined, lowering Donald's manual wheelchair to the pavement. The second the platform settled, Mary was there. She stepped past the bus aide, leaned down, </w:t>
-      </w:r>
-      <w:r>
-        <w:lastRenderedPageBreak/>
-        <w:t>and wrapped her arms securely around Donald’s chest in a tight, grounding embrace. The immediate, deep physical pressure instantly neutralized the lingering sensory static of the chaotic bus ride.</w:t>
+        <w:t>The hydraulic lift whined, lowering Donald's manual wheelchair to the pavement. The second the platform settled, Mary was there. She stepped past the bus aide, leaned down, and wrapped her arms securely around Donald’s chest in a tight, grounding embrace. The immediate, deep physical pressure instantly neutralized the lingering sensory static of the chaotic bus ride.</w:t>
       </w:r>
     </w:p>
     <w:p>
@@ -526,17 +512,17 @@
     </w:p>
     <w:p>
       <w:r>
-        <w:t>She grabbed the worn rubber handles of his chair, thanked the driver, and pushed him up the driveway. The brutal, agonizing carry up the sweeping, curved staircase to their shared bedroom was a necessary evil, but once the bedroom door clicked shut behind them, the house's toxic atmosphere was entirely sealed out.</w:t>
-      </w:r>
-    </w:p>
-    <w:p>
-      <w:r>
-        <w:t>Mary transferred him onto the edge of their shared mattress, propping a couple of pillows behind his back. She pulled up her rolling desk chair, grabbed his spiral-bound notebooks from his backpack, and laid them out on the small bedside table.</w:t>
-      </w:r>
-    </w:p>
-    <w:p>
-      <w:r>
-        <w:t>"Alright, how was it?" Mary asked, pulling his sluggish, cracked tablet from the side pouch of his chair and handing it to him. "Survive the gauntlet?"</w:t>
+        <w:t>She grabbed the worn rubber handles of his chair, thanked the driver, and pushed him up the driveway and through the front doors. Leaving the heavy manual chair parked securely at the base of the stairs, she braced herself. The brutal, agonizing carry up the sweeping, curved staircase to their shared bedroom was a necessary evil. Balancing his weight securely while keeping his school backpack slung over her shoulder was exhausting, but once the bedroom door clicked shut behind them, the house's toxic atmosphere was entirely sealed out.</w:t>
+      </w:r>
+    </w:p>
+    <w:p>
+      <w:r>
+        <w:t>Mary settled him onto the edge of their shared mattress, propping a couple of pillows behind his back. She pulled up her rolling desk chair, unzipped his backpack, and laid his spiral-bound notebooks out on the small bedside table.</w:t>
+      </w:r>
+    </w:p>
+    <w:p>
+      <w:r>
+        <w:t>"Alright, how was it?" Mary asked, pulling his sluggish, cracked tablet from the front pouch of his bag and handing it to him. "Survive the gauntlet?"</w:t>
       </w:r>
     </w:p>
     <w:p>
@@ -593,7 +579,6 @@
           <w:i/>
           <w:iCs/>
         </w:rPr>
-        <w:lastRenderedPageBreak/>
         <w:t>She said she hadn't thought about that. I told her I was going to the nurse.</w:t>
       </w:r>
     </w:p>
@@ -649,61 +634,6 @@
     <w:p>
       <w:r>
         <w:t xml:space="preserve">"Okay, number four," Mary said, reading the prompt. "Integration by parts. We need to evaluate the integral of </w:t>
-      </w:r>
-      <m:oMath>
-        <m:r>
-          <w:rPr>
-            <w:rFonts w:ascii="Cambria Math" w:hAnsi="Cambria Math"/>
-          </w:rPr>
-          <m:t>x</m:t>
-        </m:r>
-        <m:func>
-          <m:funcPr>
-            <m:ctrlPr>
-              <w:rPr>
-                <w:rFonts w:ascii="Cambria Math" w:hAnsi="Cambria Math"/>
-              </w:rPr>
-            </m:ctrlPr>
-          </m:funcPr>
-          <m:fName>
-            <m:r>
-              <m:rPr>
-                <m:sty m:val="p"/>
-              </m:rPr>
-              <w:rPr>
-                <w:rFonts w:ascii="Cambria Math" w:hAnsi="Cambria Math"/>
-              </w:rPr>
-              <m:t>cos</m:t>
-            </m:r>
-          </m:fName>
-          <m:e>
-            <m:d>
-              <m:dPr>
-                <m:ctrlPr>
-                  <w:rPr>
-                    <w:rFonts w:ascii="Cambria Math" w:hAnsi="Cambria Math"/>
-                  </w:rPr>
-                </m:ctrlPr>
-              </m:dPr>
-              <m:e>
-                <m:r>
-                  <w:rPr>
-                    <w:rFonts w:ascii="Cambria Math" w:hAnsi="Cambria Math"/>
-                  </w:rPr>
-                  <m:t>x</m:t>
-                </m:r>
-              </m:e>
-            </m:d>
-          </m:e>
-        </m:func>
-      </m:oMath>
-      <w:r>
-        <w:t>."</w:t>
-      </w:r>
-    </w:p>
-    <w:p>
-      <w:r>
-        <w:t xml:space="preserve">Donald looked at the equation: </w:t>
       </w:r>
       <m:oMath>
         <m:nary>
@@ -775,12 +705,88 @@
         </m:r>
       </m:oMath>
       <w:r>
+        <w:t>."</w:t>
+      </w:r>
+    </w:p>
+    <w:p>
+      <w:r>
+        <w:t xml:space="preserve">Donald looked at the equation: </w:t>
+      </w:r>
+      <m:oMath>
+        <m:nary>
+          <m:naryPr>
+            <m:limLoc m:val="subSup"/>
+            <m:subHide m:val="1"/>
+            <m:supHide m:val="1"/>
+            <m:ctrlPr>
+              <w:rPr>
+                <w:rFonts w:ascii="Cambria Math" w:hAnsi="Cambria Math"/>
+              </w:rPr>
+            </m:ctrlPr>
+          </m:naryPr>
+          <m:sub/>
+          <m:sup/>
+          <m:e>
+            <m:r>
+              <w:rPr>
+                <w:rFonts w:ascii="Cambria Math" w:hAnsi="Cambria Math"/>
+              </w:rPr>
+              <m:t>x</m:t>
+            </m:r>
+          </m:e>
+        </m:nary>
+        <m:func>
+          <m:funcPr>
+            <m:ctrlPr>
+              <w:rPr>
+                <w:rFonts w:ascii="Cambria Math" w:hAnsi="Cambria Math"/>
+              </w:rPr>
+            </m:ctrlPr>
+          </m:funcPr>
+          <m:fName>
+            <m:r>
+              <m:rPr>
+                <m:sty m:val="p"/>
+              </m:rPr>
+              <w:rPr>
+                <w:rFonts w:ascii="Cambria Math" w:hAnsi="Cambria Math"/>
+              </w:rPr>
+              <m:t>cos</m:t>
+            </m:r>
+          </m:fName>
+          <m:e>
+            <m:d>
+              <m:dPr>
+                <m:ctrlPr>
+                  <w:rPr>
+                    <w:rFonts w:ascii="Cambria Math" w:hAnsi="Cambria Math"/>
+                  </w:rPr>
+                </m:ctrlPr>
+              </m:dPr>
+              <m:e>
+                <m:r>
+                  <w:rPr>
+                    <w:rFonts w:ascii="Cambria Math" w:hAnsi="Cambria Math"/>
+                  </w:rPr>
+                  <m:t>x</m:t>
+                </m:r>
+              </m:e>
+            </m:d>
+          </m:e>
+        </m:func>
+        <m:r>
+          <w:rPr>
+            <w:rFonts w:ascii="Cambria Math" w:hAnsi="Cambria Math"/>
+          </w:rPr>
+          <m:t> dx</m:t>
+        </m:r>
+      </m:oMath>
+      <w:r>
         <w:t>.</w:t>
       </w:r>
     </w:p>
     <w:p>
       <w:r>
-        <w:lastRenderedPageBreak/>
         <w:t>His analytical mind instantly segmented the variables. He tapped his tablet, breaking down the formula for her.</w:t>
       </w:r>
     </w:p>
@@ -790,7 +796,10 @@
           <w:i/>
           <w:iCs/>
         </w:rPr>
-        <w:t xml:space="preserve">Formula is </w:t>
+        <w:t>Formula is</w:t>
+      </w:r>
+      <w:r>
+        <w:t xml:space="preserve"> </w:t>
       </w:r>
       <m:oMath>
         <m:nary>
@@ -855,7 +864,10 @@
           <w:i/>
           <w:iCs/>
         </w:rPr>
-        <w:t xml:space="preserve">. Set </w:t>
+        <w:t>. Set</w:t>
+      </w:r>
+      <w:r>
+        <w:t xml:space="preserve"> </w:t>
       </w:r>
       <m:oMath>
         <m:r>
@@ -920,7 +932,10 @@
           <w:i/>
           <w:iCs/>
         </w:rPr>
-        <w:t xml:space="preserve">Set </w:t>
+        <w:t>Set</w:t>
+      </w:r>
+      <w:r>
+        <w:t xml:space="preserve"> </w:t>
       </w:r>
       <m:oMath>
         <m:r>
@@ -980,7 +995,10 @@
           <w:i/>
           <w:iCs/>
         </w:rPr>
-        <w:t xml:space="preserve">. So </w:t>
+        <w:t>. So</w:t>
+      </w:r>
+      <w:r>
+        <w:t xml:space="preserve"> </w:t>
       </w:r>
       <m:oMath>
         <m:r>
@@ -1170,7 +1188,10 @@
           <w:i/>
           <w:iCs/>
         </w:rPr>
-        <w:t xml:space="preserve">The integral of </w:t>
+        <w:t>The integral of</w:t>
+      </w:r>
+      <w:r>
+        <w:t xml:space="preserve"> </w:t>
       </w:r>
       <m:oMath>
         <m:func>
@@ -1214,11 +1235,17 @@
         </m:func>
       </m:oMath>
       <w:r>
-        <w:rPr>
-          <w:i/>
-          <w:iCs/>
-        </w:rPr>
-        <w:t xml:space="preserve"> is </w:t>
+        <w:t xml:space="preserve"> </w:t>
+      </w:r>
+      <w:r>
+        <w:rPr>
+          <w:i/>
+          <w:iCs/>
+        </w:rPr>
+        <w:t>is</w:t>
+      </w:r>
+      <w:r>
+        <w:t xml:space="preserve"> </w:t>
       </w:r>
       <m:oMath>
         <m:r>
@@ -1272,7 +1299,10 @@
           <w:i/>
           <w:iCs/>
         </w:rPr>
-        <w:t xml:space="preserve">. Final answer: </w:t>
+        <w:t>. Final answer:</w:t>
+      </w:r>
+      <w:r>
+        <w:t xml:space="preserve"> </w:t>
       </w:r>
       <m:oMath>
         <m:r>
@@ -1415,11 +1445,7 @@
     </w:p>
     <w:p>
       <w:r>
-        <w:t xml:space="preserve">"We cannot stress this enough," the meteorologist warned, his voice tight. "The long-range computer models are locking in. This piece of the polar vortex is not breaking up. We are </w:t>
-      </w:r>
-      <w:r>
-        <w:lastRenderedPageBreak/>
-        <w:t>looking at a historic, sustained freeze. Temperatures will plunge into the twenties by the weekend, and by Monday, we are tracking single digits. I urge everyone to wrap your exterior pipes, check on your neighbors, and prepare for hard winter conditions."</w:t>
+        <w:t>"We cannot stress this enough," the meteorologist warned, his voice tight. "The long-range computer models are locking in. This piece of the polar vortex is not breaking up. We are looking at a historic, sustained freeze. Temperatures will plunge into the twenties by the weekend, and by Monday, we are tracking single digits. I urge everyone to wrap your exterior pipes, check on your neighbors, and prepare for hard winter conditions."</w:t>
       </w:r>
     </w:p>
     <w:p>
@@ -1486,7 +1512,6 @@
     </w:p>
     <w:p>
       <w:r>
-        <w:lastRenderedPageBreak/>
         <w:t>Mary looked up from the notebook, her gaze locking onto Donald. Because of his cerebral palsy and lack of mobility, he couldn't generate his own body heat by moving around. His nervous system was incredibly vulnerable to temperature drops. If the house froze, his body would start shutting down long before anyone else's.</w:t>
       </w:r>
     </w:p>
@@ -1558,7 +1583,6 @@
     </w:p>
     <w:p>
       <w:r>
-        <w:lastRenderedPageBreak/>
         <w:t>"Well, look at that," Mary whispered, turning the phone so Donald could see the screen. It was an automated text message from the school district.</w:t>
       </w:r>
     </w:p>
@@ -1588,7 +1612,15 @@
     </w:p>
     <w:p>
       <w:r>
-        <w:t>Donald’s hands fluttered against his thighs in absolute agreement. Staying in his ultra-soft, tagless thermal sleep pants was a massive sensory victory.</w:t>
+        <w:t xml:space="preserve">Donald’s hands fluttered against his thighs in absolute agreement. Staying in his ultra-soft, </w:t>
+      </w:r>
+      <w:proofErr w:type="spellStart"/>
+      <w:r>
+        <w:t>tagless</w:t>
+      </w:r>
+      <w:proofErr w:type="spellEnd"/>
+      <w:r>
+        <w:t xml:space="preserve"> thermal sleep pants was a massive sensory victory.</w:t>
       </w:r>
     </w:p>
     <w:p>
@@ -1618,7 +1650,6 @@
     </w:p>
     <w:p>
       <w:r>
-        <w:lastRenderedPageBreak/>
         <w:t>"Change of plans," Mary muttered, instantly grabbing the worn handles of his manual wheelchair. She spun him around, entirely bypassing the kitchen. She hauled him right back to the base of the stairs, scooped him into a flawless, secure carry, and marched him straight back up to the absolute sanctuary of their bedroom.</w:t>
       </w:r>
     </w:p>
@@ -1629,7 +1660,15 @@
     </w:p>
     <w:p>
       <w:r>
-        <w:t>Mary brought up a tray of dry cereal and a glass of water a few minutes later, refusing to subject him to the warzone downstairs. Once he was fed and comfortable on the edge of the bed, Mary walked over to her desk and booted up her computer.</w:t>
+        <w:t xml:space="preserve">Mary brought up a tray of dry cereal and a glass of water a few minutes later, refusing to subject him to the </w:t>
+      </w:r>
+      <w:proofErr w:type="spellStart"/>
+      <w:r>
+        <w:t>warzone</w:t>
+      </w:r>
+      <w:proofErr w:type="spellEnd"/>
+      <w:r>
+        <w:t xml:space="preserve"> downstairs. Once he was fed and comfortable on the edge of the bed, Mary walked over to her desk and booted up her computer.</w:t>
       </w:r>
     </w:p>
     <w:p>
@@ -1729,15 +1768,7 @@
           <w:i/>
           <w:iCs/>
         </w:rPr>
-        <w:t xml:space="preserve">"The flight logistics are fully locked. We are flying into McKinney </w:t>
-      </w:r>
-      <w:r>
-        <w:rPr>
-          <w:i/>
-          <w:iCs/>
-        </w:rPr>
-        <w:lastRenderedPageBreak/>
-        <w:t>National Airport tomorrow morning before the worst of the storm hits. We are coming to get you."</w:t>
+        <w:t>"The flight logistics are fully locked. We are flying into McKinney National Airport tomorrow morning before the worst of the storm hits. We are coming to get you."</w:t>
       </w:r>
     </w:p>
     <w:p>
@@ -1835,7 +1866,6 @@
     </w:p>
     <w:p>
       <w:r>
-        <w:lastRenderedPageBreak/>
         <w:t>The revelation hit the small Texas bedroom like a thunderclap. Donald and Mary stared at the screen, their minds desperately trying to process the sudden shift in logistics. They had spent months mentally preparing for a quiet, modest life in Ashley's Washington apartment, bracing themselves for the terrifying vulnerability of navigating a chaotic public terminal like DFW. But to get them there, Ashley hadn't just scraped together money for commercial tickets. She had secured a private jet and the backing of a formidable ally, entirely removing the risk of Donald's father intercepting them at the gate.</w:t>
       </w:r>
     </w:p>
@@ -1892,11 +1922,7 @@
     </w:p>
     <w:p>
       <w:r>
-        <w:t xml:space="preserve">The extraction team moved with flawless, practiced precision. A convoy of pre-arranged, heavy-duty SUVs with winter-rated tires was waiting just inside the private gates. They </w:t>
-      </w:r>
-      <w:r>
-        <w:lastRenderedPageBreak/>
-        <w:t>loaded Johnny's manual wheelchair into the lead vehicle and carefully transferred him out of the freezing wind, Ashley and the rest of the team filing in closely behind.</w:t>
+        <w:t>The extraction team moved with flawless, practiced precision. A convoy of pre-arranged, heavy-duty SUVs with winter-rated tires was waiting just inside the private gates. They loaded Johnny's manual wheelchair into the lead vehicle and carefully transferred him out of the freezing wind, Ashley and the rest of the team filing in closely behind.</w:t>
       </w:r>
     </w:p>
     <w:p>
@@ -1951,11 +1977,7 @@
     </w:p>
     <w:p>
       <w:r>
-        <w:t xml:space="preserve">"The local news down here is treating this like an extended snow day," Morgan explained, gesturing to the brutal purple gradient covering the map. "They are dead wrong. This isn't a </w:t>
-      </w:r>
-      <w:r>
-        <w:lastRenderedPageBreak/>
-        <w:t>winter storm. It is a collapsed lobe of the polar vortex. It's stalling directly over the state, and the ground temperatures are going to plummet into the single digits. With the wind chill, we are looking at sub-zero survivability by Sunday night."</w:t>
+        <w:t>"The local news down here is treating this like an extended snow day," Morgan explained, gesturing to the brutal purple gradient covering the map. "They are dead wrong. This isn't a winter storm. It is a collapsed lobe of the polar vortex. It's stalling directly over the state, and the ground temperatures are going to plummet into the single digits. With the wind chill, we are looking at sub-zero survivability by Sunday night."</w:t>
       </w:r>
     </w:p>
     <w:p>
@@ -2005,7 +2027,6 @@
     </w:p>
     <w:p>
       <w:r>
-        <w:lastRenderedPageBreak/>
         <w:t>Ashley turned away from the television, pacing the length of the suite. The air in the room suddenly felt heavy, suffocating. She stopped at the floor-to-ceiling window, looking down at the iced-over, treacherous streets of McKinney.</w:t>
       </w:r>
     </w:p>
@@ -2073,7 +2094,6 @@
         <w:pStyle w:val="Heading2"/>
       </w:pPr>
       <w:r>
-        <w:lastRenderedPageBreak/>
         <w:t>Chapter 5: The Deep Freeze – Saturday, February 13, 2021</w:t>
       </w:r>
     </w:p>
@@ -2137,7 +2157,6 @@
     </w:p>
     <w:p>
       <w:r>
-        <w:lastRenderedPageBreak/>
         <w:t>But Donald also possessed a sharp, analytical mind, and he fully understood the math of his own existence.</w:t>
       </w:r>
     </w:p>
@@ -2199,7 +2218,6 @@
     </w:p>
     <w:p>
       <w:r>
-        <w:lastRenderedPageBreak/>
         <w:t>The fear of the cold was no longer just a nagging thought; it was a physical weight sitting on her chest. She had already fortified their upstairs bedroom, dragging every blanket, quilt, and winter garment she could find into a massive nest on the mattress. But as the sun fully set outside, casting the iced-over Texas subdivision into deep, bruising shadows, Mary realized just how fragile their setup was.</w:t>
       </w:r>
     </w:p>
@@ -2250,7 +2268,6 @@
     </w:p>
     <w:p>
       <w:r>
-        <w:lastRenderedPageBreak/>
         <w:t>Mary stared at him. The sheer, delusional arrogance of the statement was staggering. She didn't care about his country club. She didn't care about his golf swing. She cared about the fact that Donald, sitting silently in the wheelchair beside her, could easily freeze to death under his own father's roof.</w:t>
       </w:r>
     </w:p>
@@ -2322,7 +2339,6 @@
     </w:p>
     <w:p>
       <w:r>
-        <w:lastRenderedPageBreak/>
         <w:t>"It's okay," Mary whispered, her voice tight. She reached blindly into her hoodie pocket, her fingers wrapping frantically around the cheap plastic casing of the AA flashlight. "It's just the wind."</w:t>
       </w:r>
     </w:p>
@@ -2358,7 +2374,15 @@
     </w:p>
     <w:p>
       <w:r>
-        <w:t>"I'm here," Mary said, her voice shaking as she crawled across the mattress, pulling the thickest fleece blanket securely around his neck. Without the heater pushing air, the ambient temperature in the room was already beginning to freefall. "I'm right here, Donald. I've got you."</w:t>
+        <w:t xml:space="preserve">"I'm here," Mary said, her voice shaking as she crawled across the mattress, pulling the thickest fleece blanket securely around his neck. Without the heater pushing air, the ambient temperature in the room was already beginning to </w:t>
+      </w:r>
+      <w:proofErr w:type="spellStart"/>
+      <w:r>
+        <w:t>freefall</w:t>
+      </w:r>
+      <w:proofErr w:type="spellEnd"/>
+      <w:r>
+        <w:t>. "I'm right here, Donald. I've got you."</w:t>
       </w:r>
     </w:p>
     <w:p>
@@ -2386,13 +2410,20 @@
     </w:p>
     <w:p>
       <w:r>
-        <w:lastRenderedPageBreak/>
         <w:t>"I can make that run," Emma stated, tapping her finger against the glowing blue line of the Dallas North Tollway on the screen. "Give me the keys to the lead SUV. I'll throw heavy chains on the tires and punch a hole straight down the tollway. I can have us at Donald's front door in under thirty minutes. The second the clock strikes midnight, we load him and extract."</w:t>
       </w:r>
     </w:p>
     <w:p>
       <w:r>
-        <w:t>Sitting at the head of the dining table, Victoria Vance didn't even look up from her datapad.</w:t>
+        <w:t xml:space="preserve">Sitting at the head of the dining table, Victoria Vance didn't even look up from her </w:t>
+      </w:r>
+      <w:proofErr w:type="spellStart"/>
+      <w:r>
+        <w:t>datapad</w:t>
+      </w:r>
+      <w:proofErr w:type="spellEnd"/>
+      <w:r>
+        <w:t>.</w:t>
       </w:r>
     </w:p>
     <w:p>
@@ -2442,7 +2473,6 @@
     </w:p>
     <w:p>
       <w:r>
-        <w:lastRenderedPageBreak/>
         <w:t>Emma’s jaw tightened, but she slowly lowered her arms. She stared at the twisting spaghetti of the elevated highway interchanges on the screen, recognizing the absolute, undeniable logic in Victoria's assessment.</w:t>
       </w:r>
     </w:p>
@@ -2520,7 +2550,6 @@
     </w:p>
     <w:p>
       <w:r>
-        <w:lastRenderedPageBreak/>
         <w:t>"Morgan?" Marcus asked, his voice pitching up in absolute bewilderment. "Morgan Foster from the Keep? Hold on, I'm looking at your incoming ping on the partner board. You're routing off a localized IP in... Collin County? What the hell is a Cascade micro-climate specialist doing sitting in Texas during a catastrophic polar vortex?"</w:t>
       </w:r>
     </w:p>
@@ -2531,7 +2560,15 @@
     </w:p>
     <w:p>
       <w:r>
-        <w:t>Marcus let out a heavy, ragged sigh that crackled through the phone speaker. "Jesus, Morgan. You picked a hell of a weekend to visit. The local news is panicking, but the reality is worse. The ERCOT grid is currently in freefall. We are watching the municipal power collapse in real time."</w:t>
+        <w:t xml:space="preserve">Marcus let out a heavy, ragged sigh that crackled through the phone speaker. "Jesus, Morgan. You picked a hell of a weekend to visit. The local news is panicking, but the reality is worse. The ERCOT grid is currently in </w:t>
+      </w:r>
+      <w:proofErr w:type="spellStart"/>
+      <w:r>
+        <w:t>freefall</w:t>
+      </w:r>
+      <w:proofErr w:type="spellEnd"/>
+      <w:r>
+        <w:t>. We are watching the municipal power collapse in real time."</w:t>
       </w:r>
     </w:p>
     <w:p>
@@ -2566,7 +2603,6 @@
     </w:p>
     <w:p>
       <w:r>
-        <w:lastRenderedPageBreak/>
         <w:t>"Wednesday afternoon for the melt. Thursday for the extraction," Morgan repeated, locking the timeline into her head. "Thanks, Marcus. Good luck with the grid down there."</w:t>
       </w:r>
     </w:p>
@@ -2625,11 +2661,7 @@
     </w:p>
     <w:p>
       <w:r>
-        <w:t xml:space="preserve">"We are making a promise right now," Victoria stated, her tone fierce and absolute. "The absolute second that ice begins to melt and the roads are physically secure, we launch. </w:t>
-      </w:r>
-      <w:r>
-        <w:lastRenderedPageBreak/>
-        <w:t>Emma, you will take the wheel of the lead vehicle. We will breach that house, and we will pull him out. But I will not risk killing that boy in a traffic accident on the way to the airport. Morgan, you have the floor. Tell us exactly when the ice breaks."</w:t>
+        <w:t>"We are making a promise right now," Victoria stated, her tone fierce and absolute. "The absolute second that ice begins to melt and the roads are physically secure, we launch. Emma, you will take the wheel of the lead vehicle. We will breach that house, and we will pull him out. But I will not risk killing that boy in a traffic accident on the way to the airport. Morgan, you have the floor. Tell us exactly when the ice breaks."</w:t>
       </w:r>
     </w:p>
     <w:p>
@@ -2679,7 +2711,6 @@
     </w:p>
     <w:p>
       <w:r>
-        <w:lastRenderedPageBreak/>
         <w:t>"Wednesday afternoon at the earliest, Thursday at the latest," Morgan confirmed gently, closing the laptop screen. "The mountain doesn't negotiate, Ashley. And neither does the ice. We have to wait it out."</w:t>
       </w:r>
     </w:p>
@@ -2733,7 +2764,6 @@
     </w:p>
     <w:p>
       <w:r>
-        <w:lastRenderedPageBreak/>
         <w:t>Under the dark, heavy weight of the blankets, Mary wrapped her arms tightly around him, pulling him flush against her side. She hooked her chin over his shoulder, pressing her hands firmly against his back. It was the only defense they had left: trapping their shared body heat within the small, insulated pocket of the blankets and hoping it was enough to keep their core temperatures stable.</w:t>
       </w:r>
     </w:p>
@@ -2787,11 +2817,7 @@
     </w:p>
     <w:p>
       <w:r>
-        <w:t xml:space="preserve">Underneath the suffocating pile of blankets, Mary shifted carefully, her numb fingers blindly searching the edge of the mattress. She had prepared for a power outage, but not for a </w:t>
-      </w:r>
-      <w:r>
-        <w:lastRenderedPageBreak/>
-        <w:t>siege. When she had raided the pantry on Wednesday night, she had grabbed things that didn't require a microwave or a refrigerator.</w:t>
+        <w:t>Underneath the suffocating pile of blankets, Mary shifted carefully, her numb fingers blindly searching the edge of the mattress. She had prepared for a power outage, but not for a siege. When she had raided the pantry on Wednesday night, she had grabbed things that didn't require a microwave or a refrigerator.</w:t>
       </w:r>
     </w:p>
     <w:p>
@@ -2871,7 +2897,6 @@
     </w:p>
     <w:p>
       <w:r>
-        <w:lastRenderedPageBreak/>
         <w:t>"I've got you," Mary breathed, panic threading through her voice as she wrapped both arms around him, burying her face into his shoulder to share every ounce of body heat she had left. "I'm here, Donald. Keep breathing. Just keep breathing."</w:t>
       </w:r>
     </w:p>
@@ -2948,7 +2973,6 @@
     </w:p>
     <w:p>
       <w:r>
-        <w:lastRenderedPageBreak/>
         <w:t>He let out a weak, barely audible sigh, his eyes rolling back slightly. He was fading out.</w:t>
       </w:r>
     </w:p>
@@ -3009,11 +3033,7 @@
     </w:p>
     <w:p>
       <w:r>
-        <w:t xml:space="preserve">Mary was lying fully flush against him, stomach-to-stomach, her arms wrapped tightly around his back. The sheer, uniform physical pressure of her body pressing him down into the mattress was heavy and absolute. For a nervous system that was currently misfiring </w:t>
-      </w:r>
-      <w:r>
-        <w:lastRenderedPageBreak/>
-        <w:t>and thrashing in panic, the deep, even pressure felt exactly like a human weighted blanket. It forced his rigid spine to yield. It grounded him, acting as a physical anchor keeping him tethered to the waking world.</w:t>
+        <w:t>Mary was lying fully flush against him, stomach-to-stomach, her arms wrapped tightly around his back. The sheer, uniform physical pressure of her body pressing him down into the mattress was heavy and absolute. For a nervous system that was currently misfiring and thrashing in panic, the deep, even pressure felt exactly like a human weighted blanket. It forced his rigid spine to yield. It grounded him, acting as a physical anchor keeping him tethered to the waking world.</w:t>
       </w:r>
     </w:p>
     <w:p>
@@ -3068,7 +3088,6 @@
     </w:p>
     <w:p>
       <w:r>
-        <w:lastRenderedPageBreak/>
         <w:t>But as she lay pressed against him now, feeling the rise and fall of his chest, she realized the boundaries of that love were shifting.</w:t>
       </w:r>
     </w:p>
@@ -3117,7 +3136,7 @@
     </w:p>
     <w:p>
       <w:r>
-        <w:t>The brutal cold of the room was relentless, a physical weight pressing down on the heavy pile of blankets.</w:t>
+        <w:t>The brutal cold of the room was relentless, a physical weight pressing down on the massive cocoon of thick blankets, heavy comforters, and pillows they had dragged onto the mattress.</w:t>
       </w:r>
     </w:p>
     <w:p>
@@ -3127,21 +3146,41 @@
     </w:p>
     <w:p>
       <w:r>
-        <w:t>Mary felt it before she heard it. The steady, exhausting rhythm of his shivering beneath her began to weaken, his chest hitching irregularly against hers. The freezing ambient air of the house was aggressively leeching the warmth from their makeshift cocoon faster than Mary's clothed body could replenish it. The thin fabric of her t-shirt and the thick cotton of his long-sleeve shirt were acting as a wall, trapping her body heat and preventing it from fully transferring into his freezing core.</w:t>
-      </w:r>
-    </w:p>
-    <w:p>
-      <w:r>
-        <w:t>Panic flared in her chest again, but this time, it was entirely focused. She wasn't going to lose him. Not today.</w:t>
-      </w:r>
-    </w:p>
-    <w:p>
-      <w:r>
-        <w:t xml:space="preserve">"Donald," Mary whispered urgently, her voice hoarse in the freezing dark. She shifted slightly, her hands framing his freezing face to force him to stay awake. "Donald, listen to </w:t>
-      </w:r>
-      <w:r>
-        <w:lastRenderedPageBreak/>
-        <w:t>me. The clothes are blocking the heat. It's not working fast enough. I need to get my heat directly into your skin."</w:t>
+        <w:t>Mary felt it before she heard it. The steady, exhausting rhythm of his shivering beneath her began to weaken, his chest hitching irregularly against hers. The freezing ambient air of the house was aggressively leeching the warmth from their makeshift nest faster than Mary's clothed body could replenish it.</w:t>
+      </w:r>
+    </w:p>
+    <w:p>
+      <w:r>
+        <w:t>Panic flared in her chest, raw and desperate. She pressed her hand flat against her own ribs, feeling the intense heat trapped beneath her thin t-shirt. Then she pressed her hand against Donald's chest—his thick cotton long-sleeve shirt felt like a wall of ice.</w:t>
+      </w:r>
+    </w:p>
+    <w:p>
+      <w:r>
+        <w:rPr>
+          <w:i/>
+          <w:iCs/>
+        </w:rPr>
+        <w:t>It's a barrier,</w:t>
+      </w:r>
+      <w:r>
+        <w:t xml:space="preserve"> she thought, a wild, unproven idea suddenly forming in the dark. </w:t>
+      </w:r>
+      <w:r>
+        <w:rPr>
+          <w:i/>
+          <w:iCs/>
+        </w:rPr>
+        <w:t>The fabric is trapping my heat and keeping it from reaching his core.</w:t>
+      </w:r>
+    </w:p>
+    <w:p>
+      <w:r>
+        <w:t>She didn't know if it would actually work. It was a crazy, desperate guess born entirely out of terror, but she wasn't going to lose him. Not today.</w:t>
+      </w:r>
+    </w:p>
+    <w:p>
+      <w:r>
+        <w:t>"Donald," Mary whispered urgently, her voice hoarse in the freezing dark. She shifted slightly, her hands framing his freezing face to force him to stay awake. "Donald, listen to me. I have a crazy idea. I don't know for sure if this will work, but we have to try."</w:t>
       </w:r>
     </w:p>
     <w:p>
@@ -3151,7 +3190,7 @@
     </w:p>
     <w:p>
       <w:r>
-        <w:t>"We need to take our shirts off," Mary explained, her heart hammering against her ribs. She was nineteen. He was eighteen. They were legally adults, and they were dying in a freezing house. The boundaries of the world before the power grid collapsed didn't matter anymore. "Skin-to-skin. It's the only way the heat will transfer. Okay?"</w:t>
+        <w:t>"I think the clothes are acting like a wall," Mary explained, her heart hammering against her ribs. She was nineteen. He was eighteen. They were legally adults, and they were dying in a freezing house. The boundaries of the world before the power grid collapsed didn't matter anymore. "We need to take our shirts off. Skin-to-skin. If we remove the barrier, maybe the heat will transfer. Okay?"</w:t>
       </w:r>
     </w:p>
     <w:p>
@@ -3173,7 +3212,7 @@
     </w:p>
     <w:p>
       <w:r>
-        <w:t>She moved with frantic efficiency. Keeping the heavy quilts draped over them like a tent to trap what little warm air remained, Mary pulled her t-shirt up and over her head, tossing it blindly into the freezing dark of the bedroom. The sub-zero air immediately bit into her bare shoulders, a shocking, agonizing sting.</w:t>
+        <w:t>She moved with frantic efficiency. Keeping the heavy comforters and quilts draped over them like a tent to trap what little warm air remained, Mary pulled her t-shirt up and over her head, tossing it blindly into the freezing dark of the bedroom. The sub-zero air immediately bit into her bare shoulders, a shocking, agonizing sting.</w:t>
       </w:r>
     </w:p>
     <w:p>
@@ -3193,7 +3232,7 @@
     </w:p>
     <w:p>
       <w:r>
-        <w:t>Almost immediately, the physics of the survival tactic took over.</w:t>
+        <w:t>Almost immediately, the physics of her desperate hypothesis took over.</w:t>
       </w:r>
     </w:p>
     <w:p>
@@ -3213,13 +3252,12 @@
     </w:p>
     <w:p>
       <w:r>
-        <w:lastRenderedPageBreak/>
         <w:t>Mary buried her face into the crook of his bare neck, her own body shivering violently as she sacrificed her heat to keep him alive. She held onto him with a fierce, absolute devotion, the steady, rhythmic thumping of his heartbeat echoing directly against her own bare chest.</w:t>
       </w:r>
     </w:p>
     <w:p>
       <w:r>
-        <w:t>They were going to make it to sunrise. She would hold him exactly like this until the ice broke.</w:t>
+        <w:t>It had worked. They were going to make it to sunrise, and she would hold him exactly like this until the ice broke.</w:t>
       </w:r>
     </w:p>
     <w:p>
@@ -3257,7 +3295,7 @@
     </w:p>
     <w:p>
       <w:r>
-        <w:t>He felt the direct, burning heat of her bare skin pressed entirely flush against his own chest. Donald's breath hitched. He shifted his head slightly on the pillow, his dark eyes adjusting to the dim light trapped under the blanket fort. He looked down, processing the absolute, undeniable reality of the situation. He was seeing her—truly seeing the bare slope of her shoulders and the unbroken press of her skin against his—for the very first time.</w:t>
+        <w:t>He felt the direct, burning heat of her bare skin pressed entirely flush against his own chest. Donald's breath hitched. He shifted his head slightly on the pillow, his dark eyes adjusting to the dim light trapped under the blanket fort. He looked down, processing the absolute, undeniable reality of the situation. He was seeing her—truly seeing the bare slope of her shoulders, the soft curve of her exposed chest, and the unbroken, intimate press of her stomach flush against his—for the very first time.</w:t>
       </w:r>
     </w:p>
     <w:p>
@@ -3267,28 +3305,99 @@
     </w:p>
     <w:p>
       <w:r>
-        <w:t>Mary felt the sudden spike in his heart rate echoing directly against her own chest. She stirred, her eyelids fluttering open. She lifted her head, her sleepy gaze immediately meeting his wide, startled eyes. She saw exactly what he was looking at, and exactly what he was processing.</w:t>
-      </w:r>
-    </w:p>
-    <w:p>
-      <w:r>
-        <w:t>Despite her absolute exhaustion, a soft, fond smile touched the corners of Mary’s lips. She didn't pull away. She didn't scramble to hide herself.</w:t>
-      </w:r>
-    </w:p>
-    <w:p>
-      <w:r>
-        <w:lastRenderedPageBreak/>
+        <w:t xml:space="preserve">But right on the heels of that awareness came a crushing, suffocating wave of conditioned shame. For years, his father's booming, arrogant voice had echoed through the McMansion, weaponizing morality to keep them in line. Richard had constantly shamed them for sharing a bedroom, completely ignoring the fact that he had never bothered to set up a functional, accessible room for Donald on the first floor. Richard had drilled it into their heads: </w:t>
+      </w:r>
+      <w:r>
+        <w:rPr>
+          <w:i/>
+          <w:iCs/>
+        </w:rPr>
+        <w:t>You are brother and sister. Siblings don't share a bed. Siblings don't touch.</w:t>
+      </w:r>
+    </w:p>
+    <w:p>
+      <w:r>
+        <w:t>Donald’s breathing grew ragged, his chest tightening in panic as the decade of gaslighting warred with the desperate reality of their survival.</w:t>
+      </w:r>
+    </w:p>
+    <w:p>
+      <w:r>
+        <w:t>Mary felt the sudden, erratic spike in his heart rate echoing directly against her own chest. She stirred, her eyelids fluttering open. She lifted her head, her sleepy gaze immediately meeting his wide, terrified eyes. She saw exactly what he was looking at, and she felt the rigid, fearful tension locking his muscles.</w:t>
+      </w:r>
+    </w:p>
+    <w:p>
+      <w:r>
+        <w:t>Despite her absolute exhaustion, a soft, fond smile touched the corners of Mary’s lips. She didn't pull away. She didn't scramble to hide herself or apologize for the proximity.</w:t>
+      </w:r>
+    </w:p>
+    <w:p>
+      <w:r>
         <w:t>"You were freezing," Mary whispered, her voice rough from sleep but entirely calm and unashamed. "The shirts were acting like insulators, Donald. They were trapping my body heat and keeping it from reaching your core. I had to get rid of the barrier so the heat could transfer directly into your skin. It was the only way."</w:t>
       </w:r>
     </w:p>
     <w:p>
       <w:r>
-        <w:t>Donald stared at her for a long second, his chaotic thoughts slowly organizing around the pure, undeniable logic of her survival tactic. He forced a stiff, deliberate nod against the mattress, letting out a soft hum of understanding. But the awareness in his eyes didn't fade. He understood the mechanical necessity of it, but the profound intimacy of the moment remained entirely unchanged.</w:t>
-      </w:r>
-    </w:p>
-    <w:p>
-      <w:r>
-        <w:t>Before the weight of that realization could settle any deeper, his body reminded him of a much more immediate, unromantic problem. Donald let out a tight, urgent vocalization, shifting his hips slightly beneath her.</w:t>
+        <w:t>Donald stared at her, forcing a stiff, deliberate nod against the mattress. He let out a soft hum of understanding, acknowledging the pure, undeniable physics of her survival tactic. But the fear in his eyes didn't fade. He squeezed his eyes shut, a soft, distressed whine vibrating in his throat as the internalized shame of breaking his father's ultimate rule threatened to overwhelm him.</w:t>
+      </w:r>
+    </w:p>
+    <w:p>
+      <w:r>
+        <w:t>Mary’s expression shifted, the sleepy warmth hardening into a fierce, absolute resolve. She knew exactly what was haunting him.</w:t>
+      </w:r>
+    </w:p>
+    <w:p>
+      <w:r>
+        <w:t>She shifted her weight slightly, bringing her hand up to gently cup his face, her thumb brushing across his cheekbone to force him to open his eyes and look at her.</w:t>
+      </w:r>
+    </w:p>
+    <w:p>
+      <w:r>
+        <w:t>"Listen to me, Donald," Mary said, her voice dropping into a quiet, unbreakable vow that cut right through the freezing dark. "I know what you're thinking. I know what he told us. But Richard lied."</w:t>
+      </w:r>
+    </w:p>
+    <w:p>
+      <w:r>
+        <w:t>Donald’s eyes widened, his breath catching in his throat.</w:t>
+      </w:r>
+    </w:p>
+    <w:p>
+      <w:r>
+        <w:t>"When I needed my birth certificate to get my driver's permit a few years ago, I went digging through Richard's office," Mary confessed, her gaze locked firmly onto his. "I found all the files. My mother and your father never got married. Nobody signed any adoption papers. You are not my legally adopted brother, and I am not your sister. We are completely, entirely unrelated."</w:t>
+      </w:r>
+    </w:p>
+    <w:p>
+      <w:r>
+        <w:t>Donald froze, his mind reeling as the psychological walls his father had built violently shattered.</w:t>
+      </w:r>
+    </w:p>
+    <w:p>
+      <w:r>
+        <w:t>"He gaslit us," Mary whispered fiercely, her thumb continuing its soothing rhythm against his cheek. "He used the word 'family' to make us feel ashamed of relying on each other. He wanted you to feel dirty for needing comfort, and he wanted me to feel like a freak for giving it to you. But he doesn't get to dictate the rules anymore. You're eighteen. I'm nineteen."</w:t>
+      </w:r>
+    </w:p>
+    <w:p>
+      <w:r>
+        <w:t>She lowered her head, resting her forehead gently against his, refusing to break the intimate, skin-to-skin contact that was keeping them both alive.</w:t>
+      </w:r>
+    </w:p>
+    <w:p>
+      <w:r>
+        <w:t>"I didn't stay by your side for ten years because I was legally obligated to," Mary promised, her voice thick with emotion. "I stayed because I chose you. I love you, Donald. I have always loved you, and I will always protect you. There is absolutely nothing wrong with this. I've got you."</w:t>
+      </w:r>
+    </w:p>
+    <w:p>
+      <w:r>
+        <w:t>The profound weight of her confession washed over him, completely neutralizing the toxic shame his father had planted. The heavy, uniform pressure of her bare body pressing him down into the mattress wasn't a violation; it was an anchor. It was the physical manifestation of a decade of chosen, unyielding devotion.</w:t>
+      </w:r>
+    </w:p>
+    <w:p>
+      <w:r>
+        <w:t>Donald let out a long, shuddering exhale, the rigid spasticity in his arms completely melting away. He lifted his stiff, uncoordinated hands, wrapping them weakly but definitively around her bare waist, pulling her flush against him. He let out a soft, bright hum of pure relief, accepting her warmth without a single ounce of fear.</w:t>
+      </w:r>
+    </w:p>
+    <w:p>
+      <w:r>
+        <w:t>Before the weight of that beautiful realization could settle any deeper, his body reminded him of a much more immediate, unromantic problem. Donald let out a tight, urgent vocalization, shifting his hips slightly beneath her.</w:t>
       </w:r>
     </w:p>
     <w:p>
@@ -3298,7 +3407,7 @@
     </w:p>
     <w:p>
       <w:r>
-        <w:t>"Okay," Mary sighed, her breath pluming as the freezing air crept in from the edge of the quilt. "Let's make this fast."</w:t>
+        <w:t>"Okay," Mary sighed, her breath pluming as the freezing air crept in from the edge of the quilt, the moment of profound intimacy giving way to urgent necessity. "Let's make this fast."</w:t>
       </w:r>
     </w:p>
     <w:p>
@@ -3323,7 +3432,6 @@
     </w:p>
     <w:p>
       <w:r>
-        <w:lastRenderedPageBreak/>
         <w:t>"We need water," Mary murmured. She reached her hand out from under the blankets, sweeping her fingers across the hardwood floor where she had left the two plastic bottles the night before.</w:t>
       </w:r>
     </w:p>
@@ -3387,7 +3495,6 @@
     </w:p>
     <w:p>
       <w:r>
-        <w:lastRenderedPageBreak/>
         <w:t>While the quiet reality of survival played out in the bedroom, the atmosphere on the first floor was undergoing a dramatic, terrifying shift.</w:t>
       </w:r>
     </w:p>
@@ -3455,7 +3562,6 @@
         <w:pStyle w:val="Heading3"/>
       </w:pPr>
       <w:r>
-        <w:lastRenderedPageBreak/>
         <w:t>Interlude: Radio Silence – Tuesday, 2:45 PM</w:t>
       </w:r>
     </w:p>
@@ -3526,7 +3632,6 @@
     </w:p>
     <w:p>
       <w:r>
-        <w:lastRenderedPageBreak/>
         <w:t>"And for the hundredth time, Emma, that is not snow out there," Morgan interrupted. The Chief Meteorologist didn't even look up from her ruggedized Quantum OS laptop. Her screen was filled with the raw, depressing telemetry data Marcus had sent her from the NWS desk. "The ambient temperature outside this hotel is currently seventeen degrees. Road salt is chemically useless below fifteen. You could put steel chains on the tires, but they won't bite into that ice—they'll just skate across it. It is a frictionless surface, and it is littered with abandoned, disabled civilian vehicles."</w:t>
       </w:r>
     </w:p>
@@ -3568,6 +3673,262 @@
     <w:p>
       <w:r>
         <w:t>Ashley opened her eyes, staring at the dead phone on the table. They just had to survive one more night.</w:t>
+      </w:r>
+    </w:p>
+    <w:p>
+      <w:pPr>
+        <w:pStyle w:val="Heading3"/>
+      </w:pPr>
+      <w:r>
+        <w:t>Part 5: The Shattered Script – 9:45 PM</w:t>
+      </w:r>
+    </w:p>
+    <w:p>
+      <w:r>
+        <w:t>The absolute, suffocating silence of the freezing McMansion was broken by a deep, structural groan.</w:t>
+      </w:r>
+    </w:p>
+    <w:p>
+      <w:r>
+        <w:t xml:space="preserve">Underneath the massive, heavy mountain of blankets, Mary and Donald lay perfectly still. The survival tactic was working. Stripped of the cotton barriers that had trapped her body heat, Mary’s bare chest remained pressed flush against his, acting as a human furnace. The profound, unbroken contact had stabilized his core temperature, his breathing slow and even against her neck. But as the ambient temperature outside finally crept just above the freezing mark, the house began to shift. </w:t>
+      </w:r>
+    </w:p>
+    <w:p>
+      <w:r>
+        <w:t xml:space="preserve">A sharp, tearing sound echoed from the first floor. It was followed by the unmistakable, violent rush of pressurized municipal water. </w:t>
+      </w:r>
+    </w:p>
+    <w:p>
+      <w:r>
+        <w:t>The ice plug in the ceiling pipes had finally melted. The saturated drywall of the massive, vaulted ceiling—unable to hold the rapidly accumulating weight of the water and soggy fiberglass insulation—gave way. A catastrophic, thunderous crash shook the floorboards as hundreds of gallons of freezing water violently collapsed directly onto Richard's pristine, expensive living room furniture.</w:t>
+      </w:r>
+    </w:p>
+    <w:p>
+      <w:r>
+        <w:t>Donald gasped, his entire body jerking in the dark as his heart rate instantly spiked against Mary’s ribs.</w:t>
+      </w:r>
+    </w:p>
+    <w:p>
+      <w:r>
+        <w:t xml:space="preserve">"Shh, I've got you," Mary whispered immediately, tightening her bare arms around his back to anchor his misfiring nervous system. "Stay still. Don't move." </w:t>
+      </w:r>
+    </w:p>
+    <w:p>
+      <w:r>
+        <w:t xml:space="preserve">Seconds later, heavy boots began stomping furiously up the sweeping, curved staircase. For Mary, those stairs were a site of grueling, agonizing vulnerability, an obstacle she had to conquer every day just to move Donald safely. For Richard, they were a runway for his rage. </w:t>
+      </w:r>
+    </w:p>
+    <w:p>
+      <w:r>
+        <w:t>The bedroom door handle rattled violently, followed by the heavy, meaty thud of Richard's fists pounding against the wood.</w:t>
+      </w:r>
+    </w:p>
+    <w:p>
+      <w:r>
+        <w:t>"Get out of bed!" Richard roared through the door, his voice echoing with absolute, unhinged panic. "The ceiling just collapsed! Get down here and start hauling water out the front door before the hardwood is ruined!"</w:t>
+      </w:r>
+    </w:p>
+    <w:p>
+      <w:r>
+        <w:t xml:space="preserve">From the pitch-black sanctuary of the mattress, Mary didn't flinch. She felt the rigid tension locking Donald's muscles, his terrified breath pluming in the freezing air creeping in from the edge of the quilt. She simply pressed her cheek against his hair, maintaining the life-saving thermal transfer. </w:t>
+      </w:r>
+    </w:p>
+    <w:p>
+      <w:r>
+        <w:t>"I'm not opening the door," Mary called back, her voice startlingly calm against his screaming. "I have to keep Donald warm."</w:t>
+      </w:r>
+    </w:p>
+    <w:p>
+      <w:r>
+        <w:t>"You selfish, ungrateful brat!" Saundra’s shrill voice joined in from the hallway, vibrating with hysteria. "Get out here right now!"</w:t>
+      </w:r>
+    </w:p>
+    <w:p>
+      <w:r>
+        <w:t>"Open this door, or you are done!" Richard screamed, his fists hammering the wood so hard the doorframe shook. Stripped of his control and frantic over the destruction of his ultimate status symbol, he played the only card he thought he had left. He weaponized their survival. "If you don't come down here and help me save this house, the absolute second this ice melts, you and the cripple are out on the street! I will throw you both out with nothing! Do you hear me?!"</w:t>
+      </w:r>
+    </w:p>
+    <w:p>
+      <w:r>
+        <w:t>He dropped the slur intentionally, discarding any lingering pretense of being a father. He expected the threat of starvation and homelessness to break her. He expected her to scramble out of bed, crying and begging for forgiveness, terrified of losing the only roof over her head.</w:t>
+      </w:r>
+    </w:p>
+    <w:p>
+      <w:r>
+        <w:t xml:space="preserve">Under the heavy pile of blankets, a quiet, triumphant smile touched the corners of Mary’s lips. </w:t>
+      </w:r>
+    </w:p>
+    <w:p>
+      <w:r>
+        <w:t xml:space="preserve">She knew about the Vanguard extraction team sitting in a heated luxury hotel just a few miles away. She knew that Donald was an equal partner in a multi-billion dollar corporate empire. Richard was furiously threatening them with the exact escape plan they were already waiting to execute. </w:t>
+      </w:r>
+    </w:p>
+    <w:p>
+      <w:r>
+        <w:t>For a decade, Richard had gaslit them. He had forced her to address him as a father figure, using the fabricated boundaries of "family" to shame them and keep them small. But Mary knew the truth now. They weren't family. And she wasn't afraid of him anymore.</w:t>
+      </w:r>
+    </w:p>
+    <w:p>
+      <w:r>
+        <w:t>Mary took a slow breath, her voice slicing cleanly through the freezing dark.</w:t>
+      </w:r>
+    </w:p>
+    <w:p>
+      <w:r>
+        <w:t>"Okay, Richard. We'll leave."</w:t>
+      </w:r>
+    </w:p>
+    <w:p>
+      <w:r>
+        <w:t>On the other side of the door, the heavy pounding instantly stopped.</w:t>
+      </w:r>
+    </w:p>
+    <w:p>
+      <w:r>
+        <w:t>The silence that followed was thick, heavy, and absolute. Richard’s brain completely misfired. She hadn't begged. She hadn't cried. And for the very first time in ten years, she had used his first name.</w:t>
+      </w:r>
+    </w:p>
+    <w:p>
+      <w:r>
+        <w:t>The script was broken. He had threatened her with the absolute worst-case scenario—starving on the freezing streets with a severely disabled teenager—and she had just calmly, willingly accepted it. Stripped of his leverage and his unearned title, Richard stood in the freezing hallway, completely disarmed by a nineteen-year-old girl.</w:t>
+      </w:r>
+    </w:p>
+    <w:p>
+      <w:r>
+        <w:t>Muttering incoherently about the water downstairs, his heavy footsteps slowly retreated down the hallway, the sound of his total defeat echoing as he headed back to the ruined first floor.</w:t>
+      </w:r>
+    </w:p>
+    <w:p>
+      <w:r>
+        <w:t xml:space="preserve">Under the blankets, Donald let out a soft, breathy laugh against Mary's neck, his rigid shoulders completely relaxing. The monster outside the door had lost his teeth, and tomorrow, they were walking out. </w:t>
+      </w:r>
+    </w:p>
+    <w:p>
+      <w:pPr>
+        <w:pStyle w:val="Heading3"/>
+        <w:rPr>
+          <w:rFonts w:eastAsiaTheme="minorHAnsi"/>
+        </w:rPr>
+      </w:pPr>
+      <w:r>
+        <w:rPr>
+          <w:rFonts w:eastAsiaTheme="minorHAnsi"/>
+        </w:rPr>
+        <w:t>Interlude: The Current Loop – Tuesday, 11:30 PM</w:t>
+      </w:r>
+    </w:p>
+    <w:p>
+      <w:r>
+        <w:t>The dead silence of the blacked-out apartment complex was broken only by the howling North Texas wind, but inside the locked two-car garage, the atmosphere was a warm, insulated sanctuary.</w:t>
+      </w:r>
+    </w:p>
+    <w:p>
+      <w:r>
+        <w:t xml:space="preserve">Ethan leaned his head back against the plush faux-leather headrest of the </w:t>
+      </w:r>
+      <w:proofErr w:type="spellStart"/>
+      <w:r>
+        <w:t>Voltara</w:t>
+      </w:r>
+      <w:proofErr w:type="spellEnd"/>
+      <w:r>
+        <w:t xml:space="preserve"> Apex, watching his own breath dissolve instantly in the seventy-two-degree air of the cabin. The full EV had been set to "Sentry Cabin" mode for thirty-six hours, its massive underfloor battery pack quietly pushing consistent, electrical heat through the vents without emitting a single drop of toxic tailpipe exhaust. Outside the thick, double-paned glass of the sedan, the garage was a freezing, pitch-black void, but inside, the massive digital dashboard cast a soft, amber glow over the two brothers.</w:t>
+      </w:r>
+    </w:p>
+    <w:p>
+      <w:r>
+        <w:t xml:space="preserve">In the adjacent parking stall, Connor’s Nexus Touring hybrid sat dark and ready, its fuel tank completely topped off before the lines failed, prepared to act as their secondary mobile generator if the </w:t>
+      </w:r>
+      <w:proofErr w:type="spellStart"/>
+      <w:r>
+        <w:t>Voltara's</w:t>
+      </w:r>
+      <w:proofErr w:type="spellEnd"/>
+      <w:r>
+        <w:t xml:space="preserve"> percentage dropped too low. They had bought the two competing platforms six months ago out of pure, competitive curiosity, constantly arguing over whether full electric or split-power hybrid intelligence was the superior engineering choice.</w:t>
+      </w:r>
+    </w:p>
+    <w:p>
+      <w:r>
+        <w:t>Tonight, the debate was dead. The vehicles weren't a luxury; they were their only survival pods.</w:t>
+      </w:r>
+    </w:p>
+    <w:p>
+      <w:r>
+        <w:t>Connor shifted in the passenger seat, pulling a heavy wool blanket tighter around his shoulders. He stared out the windshield at the dark garage wall, his expression tight with a heavy, unyielding guilt that had been compounding since the grid line violently severed on Monday night.</w:t>
+      </w:r>
+    </w:p>
+    <w:p>
+      <w:r>
+        <w:t>"It feels exactly like the sheet tent, doesn't it?" Connor whispered, his voice cracking slightly in the quiet cabin.</w:t>
+      </w:r>
+    </w:p>
+    <w:p>
+      <w:r>
+        <w:t xml:space="preserve">Ethan didn't answer immediately. He kept his eyes fixed on the center infotainment screen. The display was split: one half showed the vehicle's battery telemetry sitting at eighty-two percent, while the other half displayed a live, high-definition weather radar. Because the cellular towers had died, the car was pulling its data stream through the flat, portable </w:t>
+      </w:r>
+      <w:r>
+        <w:rPr>
+          <w:b/>
+          <w:bCs/>
+        </w:rPr>
+        <w:t>Aether-Link</w:t>
+      </w:r>
+      <w:r>
+        <w:t xml:space="preserve"> satellite dish Ethan had quickly mounted to the roof of the garage before the storm hit.</w:t>
+      </w:r>
+    </w:p>
+    <w:p>
+      <w:r>
+        <w:t>But even with the high-tech connection to the outside world, Ethan knew exactly what his brother meant. The soft, ambient light of the dashboard, the tightly insulated pocket of warmth, the low hum of the climate blower—it was a brutal, direct echo of the childhood blanket forts they used to build with Mary on rainy Saturday afternoons. They had spent their entire childhoods anchoring their little sister, physically holding onto her and shielding her from the monsters in the dark.</w:t>
+      </w:r>
+    </w:p>
+    <w:p>
+      <w:r>
+        <w:t>And now, they were sitting in a hundred-thousand-dollar piece of advanced engineering while she froze.</w:t>
+      </w:r>
+    </w:p>
+    <w:p>
+      <w:r>
+        <w:t>"She was right about the models," Ethan said, his knuckles turning white against the steering wheel as he stared at the brutal purple gradient on the satellite feed. "We mocked her when she told us the weather was turning dangerous. We let Richard drill his arrogant, image-obsessed garbage into our heads until we actually started parroting it. We watched him treat Donald like a burden, we participated in the isolation, and we just walked away to our own apartment because it was easier than fighting the old man."</w:t>
+      </w:r>
+    </w:p>
+    <w:p>
+      <w:r>
+        <w:t>"If the power is out in our complex, the McMansion is a block of ice," Connor said, turning his head to look at his older brother, his eyes wide with a sudden, sharp panic. "Those vaulted ceilings, Ethan. The heat sinks straight out of the rooms. Richard didn't winterize a single pipe, and he sure as hell didn't buy Donald a decent blanket, let alone a coat."  </w:t>
+      </w:r>
+    </w:p>
+    <w:p>
+      <w:r>
+        <w:t>Ethan reached out and tapped the glass of the center screen, expanding the National Weather Service forecast pulling from the Aether-Link connection.</w:t>
+      </w:r>
+    </w:p>
+    <w:p>
+      <w:r>
+        <w:t>"Look at the projected thermal curve," Ethan stated, his tone dropping into a hard, unyielding register that mirrored the protective brother he used to be before Richard corrupted the household. "The local NWS feed shows the ambient temperature finally cresting above thirty-two degrees by Thursday morning."</w:t>
+      </w:r>
+    </w:p>
+    <w:p>
+      <w:r>
+        <w:t xml:space="preserve">Ethan turned to look at Connor, his jaw set tight. "The absolute second that digital readout hits freezing and the surface ice starts to rot, we throw the heavy snow-chains on the Nexus and the </w:t>
+      </w:r>
+      <w:proofErr w:type="spellStart"/>
+      <w:r>
+        <w:t>Voltara</w:t>
+      </w:r>
+      <w:proofErr w:type="spellEnd"/>
+      <w:r>
+        <w:t>. We are breaching that house."</w:t>
+      </w:r>
+    </w:p>
+    <w:p>
+      <w:r>
+        <w:t>Connor nodded fiercely, the relief evident in his face. "We don't just check on them, Ethan. We load them up. Donald's manual chair folds flat—we can slide it into the cargo bay of the Nexus. We bring them right back here to our place. We have the vehicles to keep them warm, we have the dry rations, and we have space."  </w:t>
+      </w:r>
+    </w:p>
+    <w:p>
+      <w:r>
+        <w:t>"We're going to fix this," Ethan promised, staring out into the dark garage, his heart aching with a desperate desire to reclaim the sibling bond they had thrown away. "We'll let them stay here for as long as they need to recover. No Richard. No Saundra. No toxic rules. We tell Donald we're sorry. We tell Mary we're her brothers again. We just have to wait for the ice to break."</w:t>
       </w:r>
     </w:p>
     <w:p>
@@ -3575,7 +3936,6 @@
         <w:pStyle w:val="Heading2"/>
       </w:pPr>
       <w:r>
-        <w:lastRenderedPageBreak/>
         <w:t>Chapter 9: The Breach – Thursday, February 18, 2021</w:t>
       </w:r>
     </w:p>
@@ -3658,7 +4018,6 @@
     </w:p>
     <w:p>
       <w:r>
-        <w:lastRenderedPageBreak/>
         <w:t>"He is eighteen," a new voice cut in. This one wasn't angry. It was terrifyingly calm, smooth, and laced with absolute, immovable authority. Victoria. "As of Tuesday midnight, your son is a legally emancipated adult. He is leaving with us. If you attempt to close that door, my driver will physically remove it from its hinges. If you attempt to physically touch my client, or his sister, I will have you federally indicted for unlawful restraint before the sun sets."</w:t>
       </w:r>
     </w:p>
@@ -3727,11 +4086,7 @@
     </w:p>
     <w:p>
       <w:r>
-        <w:t xml:space="preserve">For a fraction of a second, the tactical urgency of the breach completely evaporated. Ashley stood paralyzed, her breath catching in her throat as she looked at the boy in Mary's </w:t>
-      </w:r>
-      <w:r>
-        <w:lastRenderedPageBreak/>
-        <w:t>arms. She hadn't seen him in person since he was two years old. All her memories were of a toddler; all her recent knowledge was just data on a screen or a voice over a hidden phone line. But here he was—eighteen years old, freezing, but alive.</w:t>
+        <w:t>For a fraction of a second, the tactical urgency of the breach completely evaporated. Ashley stood paralyzed, her breath catching in her throat as she looked at the boy in Mary's arms. She hadn't seen him in person since he was two years old. All her memories were of a toddler; all her recent knowledge was just data on a screen or a voice over a hidden phone line. But here he was—eighteen years old, freezing, but alive.</w:t>
       </w:r>
     </w:p>
     <w:p>
@@ -3791,11 +4146,7 @@
     </w:p>
     <w:p>
       <w:r>
-        <w:t xml:space="preserve">Mary carefully shifted her grip, turning and gently setting Donald down into the plush, heated leather of the back seat. She collapsed immediately into the seat next to him, her </w:t>
-      </w:r>
-      <w:r>
-        <w:lastRenderedPageBreak/>
-        <w:t>exhausted muscles finally giving out. Emma took the duffel bag and the wheelchair from Ashley, tossing them effortlessly into the massive cargo area before slamming the trunk.</w:t>
+        <w:t>Mary carefully shifted her grip, turning and gently setting Donald down into the plush, heated leather of the back seat. She collapsed immediately into the seat next to him, her exhausted muscles finally giving out. Emma took the duffel bag and the wheelchair from Ashley, tossing them effortlessly into the massive cargo area before slamming the trunk.</w:t>
       </w:r>
     </w:p>
     <w:p>
@@ -3863,7 +4214,6 @@
     </w:p>
     <w:p>
       <w:r>
-        <w:lastRenderedPageBreak/>
         <w:t>For Mary, the sheer sensory shock of the room was almost paralyzing. After three days trapped in a lightless, sub-zero concrete box, the McKinney hotel suite felt like stepping onto another planet. The massive overhead lights were blazing. The television was on, quietly broadcasting a local news station. And above it all was the glorious, heavy hum of the central HVAC system pumping seventy-two-degree air into every corner of the room.</w:t>
       </w:r>
     </w:p>
@@ -3884,7 +4234,15 @@
     </w:p>
     <w:p>
       <w:r>
-        <w:t>Morgan Foster walked past them, casually tossing her heavy winter coat over a chair. The Keep's Gridmaster noted their bewildered expressions and offered a small, pragmatic smile.</w:t>
+        <w:t xml:space="preserve">Morgan Foster walked past them, casually tossing her heavy winter coat over a chair. The Keep's </w:t>
+      </w:r>
+      <w:proofErr w:type="spellStart"/>
+      <w:r>
+        <w:t>Gridmaster</w:t>
+      </w:r>
+      <w:proofErr w:type="spellEnd"/>
+      <w:r>
+        <w:t xml:space="preserve"> noted their bewildered expressions and offered a small, pragmatic smile.</w:t>
       </w:r>
     </w:p>
     <w:p>
@@ -3919,7 +4277,6 @@
     </w:p>
     <w:p>
       <w:r>
-        <w:lastRenderedPageBreak/>
         <w:t>Donald looked back at her. The exhausted, shivering boy from the freezing bedroom was gone, replaced by a quiet, profound intensity. He recognized the shape of her eyes—they mirrored his own. He understood exactly who she was, what she had built, and what she had risked to get him out of that house.</w:t>
       </w:r>
     </w:p>
@@ -3955,7 +4312,15 @@
     </w:p>
     <w:p>
       <w:r>
-        <w:t>"Slow down with the heat, Victoria," Diana commanded, her voice sharp with clinical precision as she adjusted her earpiece. "I know your instinct is to give them a heavy steak or a massive breakfast platter, but their digestive tracks are under intense physiological stress. If you flood their systems with heavy proteins and complex fats right now, you'll trigger gastric distress or worse. We treat this like a refeeding protocol."</w:t>
+        <w:t xml:space="preserve">"Slow down with the heat, Victoria," Diana commanded, her voice sharp with clinical precision as she adjusted her earpiece. "I know your instinct is to give them a heavy steak or a massive breakfast platter, but their digestive tracks are under intense physiological stress. If you flood their systems with heavy proteins and complex fats right now, you'll trigger gastric distress or worse. We treat this like a </w:t>
+      </w:r>
+      <w:proofErr w:type="spellStart"/>
+      <w:r>
+        <w:t>refeeding</w:t>
+      </w:r>
+      <w:proofErr w:type="spellEnd"/>
+      <w:r>
+        <w:t xml:space="preserve"> protocol."</w:t>
       </w:r>
     </w:p>
     <w:p>
@@ -3965,11 +4330,7 @@
     </w:p>
     <w:p>
       <w:r>
-        <w:t xml:space="preserve">"Broth and simple carbohydrates," Diana said, tapping her finger on her steel prep table for emphasis. "The body burns massive amounts of glucose during severe hypothermia from </w:t>
-      </w:r>
-      <w:r>
-        <w:lastRenderedPageBreak/>
-        <w:t>shivering. We need to replenish glycogen stores instantly without overtaxing the pancreas. Take that container of organic chicken bone broth from the fridge. Heat it until it's warm—not boiling. If it's too hot, it will shock their muted oral nerves. Add a pinch of sea salt for electrolytes."</w:t>
+        <w:t>"Broth and simple carbohydrates," Diana said, tapping her finger on her steel prep table for emphasis. "The body burns massive amounts of glucose during severe hypothermia from shivering. We need to replenish glycogen stores instantly without overtaxing the pancreas. Take that container of organic chicken bone broth from the fridge. Heat it until it's warm—not boiling. If it's too hot, it will shock their muted oral nerves. Add a pinch of sea salt for electrolytes."</w:t>
       </w:r>
     </w:p>
     <w:p>
@@ -4019,7 +4380,6 @@
     </w:p>
     <w:p>
       <w:r>
-        <w:lastRenderedPageBreak/>
         <w:t>Donald pulled back from the hug, looking from the steaming food to his sister, a massive, genuine smile breaking across his face.</w:t>
       </w:r>
     </w:p>
@@ -4084,11 +4444,7 @@
     </w:p>
     <w:p>
       <w:r>
-        <w:t xml:space="preserve">Ashley walked alongside them, her pace perfectly matched to Donald's. He kept his hand firmly clasped in hers, a grounding, physical connection he hadn't dared to let go of since they left the hotel. When she had first reached out to him in the Prosper house, it was the </w:t>
-      </w:r>
-      <w:r>
-        <w:lastRenderedPageBreak/>
-        <w:t xml:space="preserve">first time they had been in the same room since he was two years old. Now, at eighteen, the height difference, the age, the years of separation—it all felt like a fragile, beautiful dream. </w:t>
+        <w:t xml:space="preserve">Ashley walked alongside them, her pace perfectly matched to Donald's. He kept his hand firmly clasped in hers, a grounding, physical connection he hadn't dared to let go of since they left the hotel. When she had first reached out to him in the Prosper house, it was the first time they had been in the same room since he was two years old. Now, at eighteen, the height difference, the age, the years of separation—it all felt like a fragile, beautiful dream. </w:t>
       </w:r>
     </w:p>
     <w:p>
@@ -4161,7 +4517,6 @@
     </w:p>
     <w:p>
       <w:r>
-        <w:lastRenderedPageBreak/>
         <w:t>Mary stood next to his wheelchair, her hand resting casually on one of the push handles. She glanced up at the illuminated digital route map above the doors, counting the glowing dots that stretched down the length of the line.</w:t>
       </w:r>
     </w:p>
@@ -4217,7 +4572,6 @@
     </w:p>
     <w:p>
       <w:r>
-        <w:lastRenderedPageBreak/>
         <w:t>They rode up to the mezzanine level, bypassed the sprawling line of fare-control gates, and took a second elevator straight up to the street level.</w:t>
       </w:r>
     </w:p>
@@ -4298,7 +4652,6 @@
     </w:p>
     <w:p>
       <w:r>
-        <w:lastRenderedPageBreak/>
         <w:t>Mary immediately began scanning the surrounding pavement, her eyes searching the concrete pillars and crowded sidewalks for another orange transit sign. "Okay," Mary said, pulling her duffel bag higher on her shoulder to secure it. "Which stop is the next connection? Are we taking another bus further south?"</w:t>
       </w:r>
     </w:p>
@@ -4359,7 +4712,6 @@
     </w:p>
     <w:p>
       <w:r>
-        <w:lastRenderedPageBreak/>
         <w:t>Ashley looked down at the boy in the wheelchair, her eyes shining with fierce, protective pride. The ten years of waiting, the brutal legal maneuvering, and the terrifying extraction in the Texas ice had all been for this exact moment.</w:t>
       </w:r>
     </w:p>
@@ -4398,7 +4750,15 @@
     </w:p>
     <w:p>
       <w:r>
-        <w:t xml:space="preserve">As they approached, Mary’s eyes tracked the massive, gold-tinted glass shafts. She realized with a jolt that these were the Scenic Elevators, and that after clearing the first few floors, the tri-car exterior shaft broke through the building's shell to run completely exposed on the outside of the tower. </w:t>
+        <w:t xml:space="preserve">As they approached, Mary’s eyes tracked the massive, gold-tinted glass shafts. She realized with a jolt that these were the Scenic Elevators, and that after clearing the first few floors, the </w:t>
+      </w:r>
+      <w:proofErr w:type="spellStart"/>
+      <w:r>
+        <w:t>tri-car</w:t>
+      </w:r>
+      <w:proofErr w:type="spellEnd"/>
+      <w:r>
+        <w:t xml:space="preserve"> exterior shaft broke through the building's shell to run completely exposed on the outside of the tower. </w:t>
       </w:r>
     </w:p>
     <w:p>
@@ -4428,7 +4788,6 @@
     </w:p>
     <w:p>
       <w:r>
-        <w:lastRenderedPageBreak/>
         <w:t xml:space="preserve">She pivoted without hesitation, leading them away from the polished glass shafts and deep into the towering concrete center of the building. She stopped in front of a pair of heavy, unmarked doors that looked exactly like a restricted mechanical closet. </w:t>
       </w:r>
     </w:p>
@@ -4528,7 +4887,6 @@
     </w:p>
     <w:p>
       <w:r>
-        <w:lastRenderedPageBreak/>
         <w:t>Mary braced herself, instinctively stepping closer to the back of Donald's wheelchair, expecting to be met by a sterile penthouse lobby or a wall of intimidating corporate security.</w:t>
       </w:r>
     </w:p>
@@ -4591,7 +4949,15 @@
     </w:p>
     <w:p>
       <w:r>
-        <w:t xml:space="preserve">But as he looked from Chelsea, to Diana, and then down to the perfectly flush, zero-threshold flooring that extended seamlessly through the entire massive floorplan, a staggering realization hit his exhausted nervous system. </w:t>
+        <w:t xml:space="preserve">But as he looked from Chelsea, to Diana, and then down to the perfectly flush, zero-threshold flooring that extended seamlessly through the entire massive </w:t>
+      </w:r>
+      <w:proofErr w:type="spellStart"/>
+      <w:r>
+        <w:t>floorplan</w:t>
+      </w:r>
+      <w:proofErr w:type="spellEnd"/>
+      <w:r>
+        <w:t xml:space="preserve">, a staggering realization hit his exhausted nervous system. </w:t>
       </w:r>
     </w:p>
     <w:p>
@@ -4601,7 +4967,6 @@
     </w:p>
     <w:p>
       <w:r>
-        <w:lastRenderedPageBreak/>
         <w:t xml:space="preserve">Diana tapped a quick sequence on her mounted MagnaByte mPad. The digital, synthesized voice from her Augmentative and Alternative Communication software—a voice not unlike his own—echoed warmly across the kitchen. </w:t>
       </w:r>
     </w:p>
@@ -4675,7 +5040,6 @@
     </w:p>
     <w:p>
       <w:r>
-        <w:lastRenderedPageBreak/>
         <w:t>"Then quiet is what he gets," Amanda nodded. She walked over to the heavy butcher-block island, pulling out a sleek leather folio. "Before you both disappear into the quiet zones to crash, I need five minutes of your time to discuss Monday morning."  </w:t>
       </w:r>
     </w:p>
@@ -4733,7 +5097,6 @@
     </w:p>
     <w:p>
       <w:r>
-        <w:lastRenderedPageBreak/>
         <w:t>Amanda pulled a second, blank legal pad from her folio. "Now, to finalize the enrollment, the district requires an Individualized Education Program—an IEP. But I haven't drafted a single word of it."</w:t>
       </w:r>
     </w:p>
@@ -4818,15 +5181,7 @@
           <w:i/>
           <w:iCs/>
         </w:rPr>
-        <w:t xml:space="preserve">"I don't know what classes </w:t>
-      </w:r>
-      <w:r>
-        <w:rPr>
-          <w:i/>
-          <w:iCs/>
-        </w:rPr>
-        <w:lastRenderedPageBreak/>
-        <w:t>to take besides the basics. I don't know what I want to do with my life. He never let me choose anything or try anything new. My mind is just... a blank slate."</w:t>
+        <w:t>"I don't know what classes to take besides the basics. I don't know what I want to do with my life. He never let me choose anything or try anything new. My mind is just... a blank slate."</w:t>
       </w:r>
     </w:p>
     <w:p>
@@ -4900,12 +5255,19 @@
     </w:p>
     <w:p>
       <w:r>
-        <w:t>"Gridmaster," Amanda greeted smoothly. "What does the Texas weather telemetry look like?"</w:t>
-      </w:r>
-    </w:p>
-    <w:p>
-      <w:r>
-        <w:lastRenderedPageBreak/>
+        <w:t>"</w:t>
+      </w:r>
+      <w:proofErr w:type="spellStart"/>
+      <w:r>
+        <w:t>Gridmaster</w:t>
+      </w:r>
+      <w:proofErr w:type="spellEnd"/>
+      <w:r>
+        <w:t>," Amanda greeted smoothly. "What does the Texas weather telemetry look like?"</w:t>
+      </w:r>
+    </w:p>
+    <w:p>
+      <w:r>
         <w:t>"The high-pressure ridge is moving east," Morgan's voice echoed clearly over the secure line, broadcasting from her office at the mountain fortress. "The freeze is actively breaking across Collin County. Surface streets will be entirely slush by tomorrow afternoon. Given the local grid stabilization, I'd bet heavy money that the Prosper school district attempts a standard opening bell on Monday morning."</w:t>
       </w:r>
     </w:p>
@@ -4951,11 +5313,7 @@
     </w:p>
     <w:p>
       <w:r>
-        <w:t xml:space="preserve">"And just to ensure we control the entire board," Amanda added, her tone laced with absolute satisfaction as the machine scanned the second batch, "I am faxing the enrollment and IEP demands directly to the Meridian Unified School District. When </w:t>
-      </w:r>
-      <w:r>
-        <w:lastRenderedPageBreak/>
-        <w:t>Monday rolls around, Prosper knows exactly not to look for him, and Meridian knows exactly to expect him."</w:t>
+        <w:t>"And just to ensure we control the entire board," Amanda added, her tone laced with absolute satisfaction as the machine scanned the second batch, "I am faxing the enrollment and IEP demands directly to the Meridian Unified School District. When Monday rolls around, Prosper knows exactly not to look for him, and Meridian knows exactly to expect him."</w:t>
       </w:r>
     </w:p>
     <w:p>
@@ -4988,7 +5346,15 @@
     </w:p>
     <w:p>
       <w:r>
-        <w:t xml:space="preserve">When they finally woke, the frantic, survival-mode exhaustion had faded into a dull ache. They took the whisper-quiet internal glass elevator back down to the 130th-floor Hearth, where Diana Whitaker's strict refeeding protocol was continuing. Waiting for them on the massive butcher-block island were small, easily digestible bowls of warm rice and roasted vegetables. </w:t>
+        <w:t xml:space="preserve">When they finally woke, the frantic, survival-mode exhaustion had faded into a dull ache. They took the whisper-quiet internal glass elevator back down to the 130th-floor Hearth, where Diana Whitaker's strict </w:t>
+      </w:r>
+      <w:proofErr w:type="spellStart"/>
+      <w:r>
+        <w:t>refeeding</w:t>
+      </w:r>
+      <w:proofErr w:type="spellEnd"/>
+      <w:r>
+        <w:t xml:space="preserve"> protocol was continuing. Waiting for them on the massive butcher-block island were small, easily digestible bowls of warm rice and roasted vegetables. </w:t>
       </w:r>
     </w:p>
     <w:p>
@@ -5008,11 +5374,7 @@
     </w:p>
     <w:p>
       <w:r>
-        <w:t xml:space="preserve">"I'm Susan," the twenty-four-year-old grinned, leaning against the counter in her work pants. "If the building is a body, I'm the heart and lungs. I manage the high-voltage </w:t>
-      </w:r>
-      <w:r>
-        <w:lastRenderedPageBreak/>
-        <w:t xml:space="preserve">electrical grid, the HVAC chillers, and the plumbing. I spend most of my time in the mechanical floors wearing a hard hat". </w:t>
+        <w:t xml:space="preserve">"I'm Susan," the twenty-four-year-old grinned, leaning against the counter in her work pants. "If the building is a body, I'm the heart and lungs. I manage the high-voltage electrical grid, the HVAC chillers, and the plumbing. I spend most of my time in the mechanical floors wearing a hard hat". </w:t>
       </w:r>
     </w:p>
     <w:p>
@@ -5116,7 +5478,6 @@
     </w:p>
     <w:p>
       <w:r>
-        <w:lastRenderedPageBreak/>
         <w:t>Donald’s breath hitched. His hands immediately flew over his AAC device, his typing frantic and slightly uncoordinated as a sudden wave of sheer terror spiked through his chest.</w:t>
       </w:r>
     </w:p>
@@ -5215,7 +5576,6 @@
     </w:p>
     <w:p>
       <w:r>
-        <w:lastRenderedPageBreak/>
         <w:t>Ashley beamed, grabbing her master security fob off the counter. "Then let's go. Welcome to the Board of Directors."</w:t>
       </w:r>
     </w:p>
@@ -5296,7 +5656,6 @@
     </w:p>
     <w:p>
       <w:r>
-        <w:lastRenderedPageBreak/>
         <w:t xml:space="preserve">The transition was jarring. They stepped out of the concrete corridor and directly into the polished, intimidatingly sleek environment of Floor 16—the official, legally registered headquarters of the family's LLC. </w:t>
       </w:r>
     </w:p>
@@ -5366,11 +5725,7 @@
     </w:p>
     <w:p>
       <w:r>
-        <w:t xml:space="preserve">The rest of the family froze, instinctively giving them space. As they watched Mary seamlessly anchor him, any lingering, protective doubts they might have harbored about </w:t>
-      </w:r>
-      <w:r>
-        <w:lastRenderedPageBreak/>
-        <w:t>the teenager from Texas evaporated. They saw with absolute clarity that Mary didn't care about the mahogany table, the LLC, or the money. Her entire universe was the boy in her arms.</w:t>
+        <w:t>The rest of the family froze, instinctively giving them space. As they watched Mary seamlessly anchor him, any lingering, protective doubts they might have harbored about the teenager from Texas evaporated. They saw with absolute clarity that Mary didn't care about the mahogany table, the LLC, or the money. Her entire universe was the boy in her arms.</w:t>
       </w:r>
     </w:p>
     <w:p>
@@ -5467,7 +5822,6 @@
     </w:p>
     <w:p>
       <w:r>
-        <w:lastRenderedPageBreak/>
         <w:t>Before anyone stepped out of the elevator, Susan reached into a heavy metal storage cage bolted to the concrete wall just outside the doors. She pulled out four reinforced hard hats.</w:t>
       </w:r>
     </w:p>
@@ -5525,11 +5879,7 @@
     </w:p>
     <w:p>
       <w:r>
-        <w:t xml:space="preserve">"And over there," Susan pointed toward a section of the structural foundation resting on massive, rubberized pylons, "are the heavy-duty vibration dampeners. Because the B8 </w:t>
-      </w:r>
-      <w:r>
-        <w:lastRenderedPageBreak/>
-        <w:t xml:space="preserve">Metro concourse and the train platforms are right beneath us, these dampeners absorb the seismic shock of the heavy-rail trains so the billionaires in the penthouses don't feel their floors vibrate". </w:t>
+        <w:t xml:space="preserve">"And over there," Susan pointed toward a section of the structural foundation resting on massive, rubberized pylons, "are the heavy-duty vibration dampeners. Because the B8 Metro concourse and the train platforms are right beneath us, these dampeners absorb the seismic shock of the heavy-rail trains so the billionaires in the penthouses don't feel their floors vibrate". </w:t>
       </w:r>
     </w:p>
     <w:p>
@@ -5587,7 +5937,6 @@
     </w:p>
     <w:p>
       <w:r>
-        <w:lastRenderedPageBreak/>
         <w:t>Mary unclipped the strap of his hard hat and lifted it off, placing it back into the metal storage cage along with the others. She brushed his hair back affectionately. "Better?"</w:t>
       </w:r>
     </w:p>
@@ -5669,11 +6018,7 @@
     </w:p>
     <w:p>
       <w:r>
-        <w:t xml:space="preserve">In the center of the transfer deck, swift internal architectural escalators glided upward, ferrying residents to the amenities on the floors above. Because the escalators were </w:t>
-      </w:r>
-      <w:r>
-        <w:lastRenderedPageBreak/>
-        <w:t xml:space="preserve">structurally inaccessible for Donald's manual wheelchair, Susan guided them seamlessly to a sleek, glass-enclosed ADA-compliant local elevator nestled directly beside the escalator bank. </w:t>
+        <w:t xml:space="preserve">In the center of the transfer deck, swift internal architectural escalators glided upward, ferrying residents to the amenities on the floors above. Because the escalators were structurally inaccessible for Donald's manual wheelchair, Susan guided them seamlessly to a sleek, glass-enclosed ADA-compliant local elevator nestled directly beside the escalator bank. </w:t>
       </w:r>
     </w:p>
     <w:p>
@@ -5683,7 +6028,15 @@
     </w:p>
     <w:p>
       <w:r>
-        <w:t>The aisles were wide and perfectly illuminated with soft, warm lighting—a deliberate architectural choice that Arthur Sterling had likely mandated decades ago. It wasn't the chaotic, fluorescent-lit nightmare of a suburban supercenter; it was a quiet, highly organized sanctuary.</w:t>
+        <w:t xml:space="preserve">The aisles were wide and perfectly illuminated with soft, warm lighting—a deliberate architectural choice that Arthur Sterling had likely mandated decades ago. It wasn't the chaotic, fluorescent-lit nightmare of a suburban </w:t>
+      </w:r>
+      <w:proofErr w:type="spellStart"/>
+      <w:r>
+        <w:t>supercenter</w:t>
+      </w:r>
+      <w:proofErr w:type="spellEnd"/>
+      <w:r>
+        <w:t>; it was a quiet, highly organized sanctuary.</w:t>
       </w:r>
     </w:p>
     <w:p>
@@ -5742,7 +6095,6 @@
     </w:p>
     <w:p>
       <w:r>
-        <w:lastRenderedPageBreak/>
         <w:t>He was going to use the school district to trigger a truancy and welfare check, forcing local authorities to track Donald down and compel his return.</w:t>
       </w:r>
     </w:p>
@@ -5803,7 +6155,6 @@
     </w:p>
     <w:p>
       <w:r>
-        <w:lastRenderedPageBreak/>
         <w:t>"He doesn't know what he's signing!" Richard roared, losing his temper completely. "He has disabilities! Someone manipulated him into doing this!"</w:t>
       </w:r>
     </w:p>
@@ -5849,7 +6200,7 @@
 </file>
 
 <file path=word/styles.xml><?xml version="1.0" encoding="utf-8"?>
-<w:styles xmlns:mc="http://schemas.openxmlformats.org/markup-compatibility/2006" xmlns:r="http://schemas.openxmlformats.org/officeDocument/2006/relationships" xmlns:w="http://schemas.openxmlformats.org/wordprocessingml/2006/main" xmlns:w14="http://schemas.microsoft.com/office/word/2010/wordml" xmlns:w15="http://schemas.microsoft.com/office/word/2012/wordml" xmlns:w16cex="http://schemas.microsoft.com/office/word/2018/wordml/cex" xmlns:w16cid="http://schemas.microsoft.com/office/word/2016/wordml/cid" xmlns:w16="http://schemas.microsoft.com/office/word/2018/wordml" xmlns:w16du="http://schemas.microsoft.com/office/word/2023/wordml/word16du" xmlns:w16sdtdh="http://schemas.microsoft.com/office/word/2020/wordml/sdtdatahash" xmlns:w16sdtfl="http://schemas.microsoft.com/office/word/2024/wordml/sdtformatlock" xmlns:w16se="http://schemas.microsoft.com/office/word/2015/wordml/symex" mc:Ignorable="w14 w15 w16se w16cid w16 w16cex w16sdtdh w16sdtfl w16du">
+<w:styles xmlns:mc="http://schemas.openxmlformats.org/markup-compatibility/2006" xmlns:r="http://schemas.openxmlformats.org/officeDocument/2006/relationships" xmlns:w="http://schemas.openxmlformats.org/wordprocessingml/2006/main" xmlns:w14="http://schemas.microsoft.com/office/word/2010/wordml" xmlns:w15="http://schemas.microsoft.com/office/word/2012/wordml" xmlns:w16cex="http://schemas.microsoft.com/office/word/2018/wordml/cex" xmlns:w16cid="http://schemas.microsoft.com/office/word/2016/wordml/cid" xmlns:w16="http://schemas.microsoft.com/office/word/2018/wordml" xmlns:w16sdtdh="http://schemas.microsoft.com/office/word/2020/wordml/sdtdatahash" xmlns:w16sdtfl="http://schemas.microsoft.com/office/word/2024/wordml/sdtformatlock" xmlns:w16se="http://schemas.microsoft.com/office/word/2015/wordml/symex" xmlns:w16du="http://schemas.microsoft.com/office/word/2023/wordml/word16du" mc:Ignorable="w14 w15 w16se w16cid w16 w16cex w16sdtdh w16sdtfl w16du">
   <w:docDefaults>
     <w:rPrDefault>
       <w:rPr>
@@ -6448,6 +6799,7 @@
   <w:style w:type="character" w:default="1" w:styleId="DefaultParagraphFont">
     <w:name w:val="Default Paragraph Font"/>
     <w:uiPriority w:val="1"/>
+    <w:semiHidden/>
     <w:unhideWhenUsed/>
   </w:style>
   <w:style w:type="table" w:default="1" w:styleId="TableNormal">

</xml_diff>